<commit_message>
ittd seminar končne ocene
</commit_message>
<xml_diff>
--- a/ITTD/Seminarji/Navodila/1_Seminar_ITTD_navodila_24_25.docx
+++ b/ITTD/Seminarji/Navodila/1_Seminar_ITTD_navodila_24_25.docx
@@ -4053,7 +4053,7 @@
           <v:shape id="ole_rId5" type="_x0000_tole_rId5" style="width:165pt;height:159.6pt;mso-wrap-distance-right:0pt" filled="f" o:ole="">
             <v:imagedata r:id="rId6" o:title=""/>
           </v:shape>
-          <o:OLEObject Type="Embed" ProgID="MSPhotoEd.3" ShapeID="ole_rId5" DrawAspect="Content" ObjectID="_1871974004" r:id="rId5"/>
+          <o:OLEObject Type="Embed" ProgID="MSPhotoEd.3" ShapeID="ole_rId5" DrawAspect="Content" ObjectID="_799364874" r:id="rId5"/>
         </w:object>
       </w:r>
     </w:p>
@@ -4075,7 +4075,15 @@
       </w:pPr>
       <w:r>
         <w:rPr/>
-        <w:t>Slika 4.1: NM z eno plastjo s nevroni [1].</w:t>
+        <w:t xml:space="preserve">Slika 4.1: NM z eno plastjo </w:t>
+      </w:r>
+      <w:r>
+        <w:rPr/>
+        <w:t>z</w:t>
+      </w:r>
+      <w:r>
+        <w:rPr/>
+        <w:t xml:space="preserve"> nevroni [1].</w:t>
       </w:r>
     </w:p>
     <w:p>
@@ -6279,7 +6287,7 @@
           <v:shape id="ole_rId9" type="_x0000_tole_rId9" style="width:18.6pt;height:19.8pt;mso-wrap-distance-right:0pt" filled="f" o:ole="">
             <v:imagedata r:id="rId10" o:title=""/>
           </v:shape>
-          <o:OLEObject Type="Embed" ProgID="MSPhotoEd.3" ShapeID="ole_rId9" DrawAspect="Content" ObjectID="_1557821369" r:id="rId9"/>
+          <o:OLEObject Type="Embed" ProgID="MSPhotoEd.3" ShapeID="ole_rId9" DrawAspect="Content" ObjectID="_92511285" r:id="rId9"/>
         </w:object>
       </w:r>
       <w:r>
@@ -7788,7 +7796,7 @@
           <v:shape id="ole_rId11" type="_x0000_tole_rId11" style="width:18.6pt;height:19.8pt;mso-wrap-distance-right:0pt" filled="f" o:ole="">
             <v:imagedata r:id="rId12" o:title=""/>
           </v:shape>
-          <o:OLEObject Type="Embed" ProgID="MSPhotoEd.3" ShapeID="ole_rId11" DrawAspect="Content" ObjectID="_657222651" r:id="rId11"/>
+          <o:OLEObject Type="Embed" ProgID="MSPhotoEd.3" ShapeID="ole_rId11" DrawAspect="Content" ObjectID="_341755643" r:id="rId11"/>
         </w:object>
       </w:r>
       <w:r>
@@ -8832,7 +8840,7 @@
                 <w:iCs/>
               </w:rPr>
             </w:pPr>
-            <w:bookmarkStart w:id="20" w:name="RANGE!A1%2525252525253AE53"/>
+            <w:bookmarkStart w:id="20" w:name="RANGE!A1%252525252525253AE53"/>
             <w:r>
               <w:rPr>
                 <w:rFonts w:cs="Arial" w:ascii="Arial Narrow" w:hAnsi="Arial Narrow"/>
@@ -16183,7 +16191,7 @@
                               <w:rStyle w:val="PageNumber"/>
                               <w:color w:val="000000"/>
                             </w:rPr>
-                            <w:t>8</w:t>
+                            <w:t>12</w:t>
                           </w:r>
                           <w:r>
                             <w:rPr>
@@ -16244,7 +16252,7 @@
                         <w:rStyle w:val="PageNumber"/>
                         <w:color w:val="000000"/>
                       </w:rPr>
-                      <w:t>8</w:t>
+                      <w:t>12</w:t>
                     </w:r>
                     <w:r>
                       <w:rPr>
@@ -16316,7 +16324,7 @@
       </w:pPr>
       <w:r>
         <w:rPr>
-          <w:rStyle w:val="FootnoteCharacters2"/>
+          <w:rStyle w:val="FootnoteCharacters"/>
         </w:rPr>
         <w:footnoteRef/>
       </w:r>
@@ -17152,7 +17160,6 @@
   </w:style>
   <w:style w:type="character" w:styleId="FootnoteCharacters">
     <w:name w:val="Footnote Characters"/>
-    <w:basedOn w:val="DefaultParagraphFont"/>
     <w:semiHidden/>
     <w:qFormat/>
     <w:rsid w:val="00f737f8"/>

</xml_diff>